<commit_message>
Fix PWA update flow and update documentation with detailed PWA section
- Fix main.jsx: dispatch 'pwa-update-available' event instead of calling
  updateSW(true) directly, so UpdatePrompt banner is shown to the user
- Update DOCUMENTAZIONE_TECNICA.md section 9 with complete PWA details:
  manifest config, SW registration, caching strategies table, components,
  meta tags, i18n translations
- Update ANALISI_FUNZIONALE.docx with expanded PWA section covering
  all 6 subsections

https://claude.ai/code/session_01E5gZhwQEeN7zfSCsTAgeNT
</commit_message>
<xml_diff>
--- a/ANALISI_FUNZIONALE.docx
+++ b/ANALISI_FUNZIONALE.docx
@@ -6688,31 +6688,415 @@
     </w:p>
     <w:p>
       <w:r>
-        <w:t>L'applicazione e configurata come Progressive Web App tramite vite-plugin-pwa con Workbox:</w:t>
+        <w:t>L'applicazione e configurata come Progressive Web App completa tramite vite-plugin-pwa 0.21.0 con Workbox per il caching e un Service Worker registrato con autoUpdate.</w:t>
       </w:r>
     </w:p>
     <w:p>
       <w:pPr>
-        <w:pStyle w:val="ListBullet"/>
+        <w:pStyle w:val="Heading3"/>
       </w:pPr>
       <w:r>
-        <w:t>Installabilita: Prompt di installazione che appare quando il browser rileva i requisiti PWA soddisfatti.</w:t>
+        <w:t>12.3.1 Web App Manifest</w:t>
       </w:r>
     </w:p>
     <w:p>
-      <w:pPr>
-        <w:pStyle w:val="ListBullet"/>
-      </w:pPr>
       <w:r>
-        <w:t>Service Worker: Gestisce il caching delle risorse statiche e dei chunk JavaScript.</w:t>
+        <w:t>Il manifest viene generato automaticamente da vite-plugin-pwa con i seguenti parametri:</w:t>
+      </w:r>
+    </w:p>
+    <w:tbl>
+      <w:tblPr>
+        <w:tblStyle w:val="TableGrid"/>
+        <w:tblW w:type="auto" w:w="0"/>
+        <w:jc w:val="center"/>
+        <w:tblLook w:firstColumn="1" w:firstRow="1" w:lastColumn="0" w:lastRow="0" w:noHBand="0" w:noVBand="1" w:val="04A0"/>
+      </w:tblPr>
+      <w:tblGrid>
+        <w:gridCol w:w="4320"/>
+        <w:gridCol w:w="4320"/>
+      </w:tblGrid>
+      <w:tr>
+        <w:tc>
+          <w:tcPr>
+            <w:tcW w:type="dxa" w:w="2835"/>
+            <w:shd w:fill="1e40af"/>
+          </w:tcPr>
+          <w:p>
+            <w:r>
+              <w:rPr>
+                <w:b/>
+                <w:color w:val="FFFFFF"/>
+                <w:sz w:val="20"/>
+              </w:rPr>
+              <w:t>Parametro</w:t>
+            </w:r>
+          </w:p>
+        </w:tc>
+        <w:tc>
+          <w:tcPr>
+            <w:tcW w:type="dxa" w:w="6236"/>
+            <w:shd w:fill="1e40af"/>
+          </w:tcPr>
+          <w:p>
+            <w:r>
+              <w:rPr>
+                <w:b/>
+                <w:color w:val="FFFFFF"/>
+                <w:sz w:val="20"/>
+              </w:rPr>
+              <w:t>Valore</w:t>
+            </w:r>
+          </w:p>
+        </w:tc>
+      </w:tr>
+      <w:tr>
+        <w:tc>
+          <w:tcPr>
+            <w:tcW w:type="dxa" w:w="2835"/>
+          </w:tcPr>
+          <w:p>
+            <w:r>
+              <w:rPr>
+                <w:sz w:val="20"/>
+              </w:rPr>
+              <w:t>name</w:t>
+            </w:r>
+          </w:p>
+        </w:tc>
+        <w:tc>
+          <w:tcPr>
+            <w:tcW w:type="dxa" w:w="6236"/>
+          </w:tcPr>
+          <w:p>
+            <w:r>
+              <w:rPr>
+                <w:sz w:val="20"/>
+              </w:rPr>
+              <w:t>Portale Recinzioni</w:t>
+            </w:r>
+          </w:p>
+        </w:tc>
+      </w:tr>
+      <w:tr>
+        <w:tc>
+          <w:tcPr>
+            <w:tcW w:type="dxa" w:w="2835"/>
+          </w:tcPr>
+          <w:p>
+            <w:r>
+              <w:rPr>
+                <w:sz w:val="20"/>
+              </w:rPr>
+              <w:t>short_name</w:t>
+            </w:r>
+          </w:p>
+        </w:tc>
+        <w:tc>
+          <w:tcPr>
+            <w:tcW w:type="dxa" w:w="6236"/>
+          </w:tcPr>
+          <w:p>
+            <w:r>
+              <w:rPr>
+                <w:sz w:val="20"/>
+              </w:rPr>
+              <w:t>Recinzioni</w:t>
+            </w:r>
+          </w:p>
+        </w:tc>
+      </w:tr>
+      <w:tr>
+        <w:tc>
+          <w:tcPr>
+            <w:tcW w:type="dxa" w:w="2835"/>
+          </w:tcPr>
+          <w:p>
+            <w:r>
+              <w:rPr>
+                <w:sz w:val="20"/>
+              </w:rPr>
+              <w:t>description</w:t>
+            </w:r>
+          </w:p>
+        </w:tc>
+        <w:tc>
+          <w:tcPr>
+            <w:tcW w:type="dxa" w:w="6236"/>
+          </w:tcPr>
+          <w:p>
+            <w:r>
+              <w:rPr>
+                <w:sz w:val="20"/>
+              </w:rPr>
+              <w:t>Configuratore recinzioni con preventivi e ordini</w:t>
+            </w:r>
+          </w:p>
+        </w:tc>
+      </w:tr>
+      <w:tr>
+        <w:tc>
+          <w:tcPr>
+            <w:tcW w:type="dxa" w:w="2835"/>
+          </w:tcPr>
+          <w:p>
+            <w:r>
+              <w:rPr>
+                <w:sz w:val="20"/>
+              </w:rPr>
+              <w:t>display</w:t>
+            </w:r>
+          </w:p>
+        </w:tc>
+        <w:tc>
+          <w:tcPr>
+            <w:tcW w:type="dxa" w:w="6236"/>
+          </w:tcPr>
+          <w:p>
+            <w:r>
+              <w:rPr>
+                <w:sz w:val="20"/>
+              </w:rPr>
+              <w:t>standalone</w:t>
+            </w:r>
+          </w:p>
+        </w:tc>
+      </w:tr>
+      <w:tr>
+        <w:tc>
+          <w:tcPr>
+            <w:tcW w:type="dxa" w:w="2835"/>
+          </w:tcPr>
+          <w:p>
+            <w:r>
+              <w:rPr>
+                <w:sz w:val="20"/>
+              </w:rPr>
+              <w:t>orientation</w:t>
+            </w:r>
+          </w:p>
+        </w:tc>
+        <w:tc>
+          <w:tcPr>
+            <w:tcW w:type="dxa" w:w="6236"/>
+          </w:tcPr>
+          <w:p>
+            <w:r>
+              <w:rPr>
+                <w:sz w:val="20"/>
+              </w:rPr>
+              <w:t>any</w:t>
+            </w:r>
+          </w:p>
+        </w:tc>
+      </w:tr>
+      <w:tr>
+        <w:tc>
+          <w:tcPr>
+            <w:tcW w:type="dxa" w:w="2835"/>
+          </w:tcPr>
+          <w:p>
+            <w:r>
+              <w:rPr>
+                <w:sz w:val="20"/>
+              </w:rPr>
+              <w:t>theme_color</w:t>
+            </w:r>
+          </w:p>
+        </w:tc>
+        <w:tc>
+          <w:tcPr>
+            <w:tcW w:type="dxa" w:w="6236"/>
+          </w:tcPr>
+          <w:p>
+            <w:r>
+              <w:rPr>
+                <w:sz w:val="20"/>
+              </w:rPr>
+              <w:t>#2563eb (blu primary)</w:t>
+            </w:r>
+          </w:p>
+        </w:tc>
+      </w:tr>
+      <w:tr>
+        <w:tc>
+          <w:tcPr>
+            <w:tcW w:type="dxa" w:w="2835"/>
+          </w:tcPr>
+          <w:p>
+            <w:r>
+              <w:rPr>
+                <w:sz w:val="20"/>
+              </w:rPr>
+              <w:t>background_color</w:t>
+            </w:r>
+          </w:p>
+        </w:tc>
+        <w:tc>
+          <w:tcPr>
+            <w:tcW w:type="dxa" w:w="6236"/>
+          </w:tcPr>
+          <w:p>
+            <w:r>
+              <w:rPr>
+                <w:sz w:val="20"/>
+              </w:rPr>
+              <w:t>#ffffff</w:t>
+            </w:r>
+          </w:p>
+        </w:tc>
+      </w:tr>
+      <w:tr>
+        <w:tc>
+          <w:tcPr>
+            <w:tcW w:type="dxa" w:w="2835"/>
+          </w:tcPr>
+          <w:p>
+            <w:r>
+              <w:rPr>
+                <w:sz w:val="20"/>
+              </w:rPr>
+              <w:t>start_url / scope</w:t>
+            </w:r>
+          </w:p>
+        </w:tc>
+        <w:tc>
+          <w:tcPr>
+            <w:tcW w:type="dxa" w:w="6236"/>
+          </w:tcPr>
+          <w:p>
+            <w:r>
+              <w:rPr>
+                <w:sz w:val="20"/>
+              </w:rPr>
+              <w:t>/</w:t>
+            </w:r>
+          </w:p>
+        </w:tc>
+      </w:tr>
+      <w:tr>
+        <w:tc>
+          <w:tcPr>
+            <w:tcW w:type="dxa" w:w="2835"/>
+          </w:tcPr>
+          <w:p>
+            <w:r>
+              <w:rPr>
+                <w:sz w:val="20"/>
+              </w:rPr>
+              <w:t>lang</w:t>
+            </w:r>
+          </w:p>
+        </w:tc>
+        <w:tc>
+          <w:tcPr>
+            <w:tcW w:type="dxa" w:w="6236"/>
+          </w:tcPr>
+          <w:p>
+            <w:r>
+              <w:rPr>
+                <w:sz w:val="20"/>
+              </w:rPr>
+              <w:t>it</w:t>
+            </w:r>
+          </w:p>
+        </w:tc>
+      </w:tr>
+      <w:tr>
+        <w:tc>
+          <w:tcPr>
+            <w:tcW w:type="dxa" w:w="2835"/>
+          </w:tcPr>
+          <w:p>
+            <w:r>
+              <w:rPr>
+                <w:sz w:val="20"/>
+              </w:rPr>
+              <w:t>categories</w:t>
+            </w:r>
+          </w:p>
+        </w:tc>
+        <w:tc>
+          <w:tcPr>
+            <w:tcW w:type="dxa" w:w="6236"/>
+          </w:tcPr>
+          <w:p>
+            <w:r>
+              <w:rPr>
+                <w:sz w:val="20"/>
+              </w:rPr>
+              <w:t>business, productivity</w:t>
+            </w:r>
+          </w:p>
+        </w:tc>
+      </w:tr>
+      <w:tr>
+        <w:tc>
+          <w:tcPr>
+            <w:tcW w:type="dxa" w:w="2835"/>
+          </w:tcPr>
+          <w:p>
+            <w:r>
+              <w:rPr>
+                <w:sz w:val="20"/>
+              </w:rPr>
+              <w:t>Icona 192x192</w:t>
+            </w:r>
+          </w:p>
+        </w:tc>
+        <w:tc>
+          <w:tcPr>
+            <w:tcW w:type="dxa" w:w="6236"/>
+          </w:tcPr>
+          <w:p>
+            <w:r>
+              <w:rPr>
+                <w:sz w:val="20"/>
+              </w:rPr>
+              <w:t>logo-192.png (PNG)</w:t>
+            </w:r>
+          </w:p>
+        </w:tc>
+      </w:tr>
+      <w:tr>
+        <w:tc>
+          <w:tcPr>
+            <w:tcW w:type="dxa" w:w="2835"/>
+          </w:tcPr>
+          <w:p>
+            <w:r>
+              <w:rPr>
+                <w:sz w:val="20"/>
+              </w:rPr>
+              <w:t>Icona 512x512</w:t>
+            </w:r>
+          </w:p>
+        </w:tc>
+        <w:tc>
+          <w:tcPr>
+            <w:tcW w:type="dxa" w:w="6236"/>
+          </w:tcPr>
+          <w:p>
+            <w:r>
+              <w:rPr>
+                <w:sz w:val="20"/>
+              </w:rPr>
+              <w:t>logo-512.png (PNG + maskable)</w:t>
+            </w:r>
+          </w:p>
+        </w:tc>
+      </w:tr>
+    </w:tbl>
+    <w:p>
+      <w:pPr>
+        <w:pStyle w:val="Heading3"/>
+      </w:pPr>
+      <w:r>
+        <w:t>12.3.2 Service Worker e Registrazione</w:t>
       </w:r>
     </w:p>
     <w:p>
-      <w:pPr>
-        <w:pStyle w:val="ListBullet"/>
-      </w:pPr>
       <w:r>
-        <w:t>Aggiornamenti: Prompt di aggiornamento quando e disponibile una nuova versione. L'utente puo aggiornare immediatamente o posticipare.</w:t>
+        <w:t>Il Service Worker viene registrato in main.jsx tramite registerSW() da virtual:pwa-register. La configurazione prevede:</w:t>
       </w:r>
     </w:p>
     <w:p>
@@ -6720,7 +7104,7 @@
         <w:pStyle w:val="ListBullet"/>
       </w:pPr>
       <w:r>
-        <w:t>Pagina Offline: Fallback dedicato quando l'utente tenta di accedere a pagine non in cache senza connessione.</w:t>
+        <w:t>registerType: autoUpdate - Il SW si aggiorna automaticamente quando rileva una nuova versione.</w:t>
       </w:r>
     </w:p>
     <w:p>
@@ -6728,7 +7112,7 @@
         <w:pStyle w:val="ListBullet"/>
       </w:pPr>
       <w:r>
-        <w:t>Banner Offline: Indicatore visuale nella parte superiore quando la connessione e assente.</w:t>
+        <w:t>skipWaiting: true - Il nuovo SW si attiva immediatamente senza attendere la chiusura delle tab.</w:t>
       </w:r>
     </w:p>
     <w:p>
@@ -6736,7 +7120,7 @@
         <w:pStyle w:val="ListBullet"/>
       </w:pPr>
       <w:r>
-        <w:t>Manifest: Configurazione PWA con nome, colori, icone per l'installazione su dispositivi.</w:t>
+        <w:t>clientsClaim: true - Il nuovo SW prende il controllo di tutti i client immediatamente.</w:t>
       </w:r>
     </w:p>
     <w:p>
@@ -6744,7 +7128,673 @@
         <w:pStyle w:val="ListBullet"/>
       </w:pPr>
       <w:r>
-        <w:t>ChunkErrorBoundary: Gestione errori di caricamento chunk obsoleti con reload automatico dalla rete.</w:t>
+        <w:t>cleanupOutdatedCaches: true - Le cache vecchie vengono rimosse automaticamente.</w:t>
+      </w:r>
+    </w:p>
+    <w:p>
+      <w:pPr>
+        <w:pStyle w:val="ListBullet"/>
+      </w:pPr>
+      <w:r>
+        <w:t>navigateFallback: /index.html - Tutte le navigation request non-API servono index.html (SPA).</w:t>
+      </w:r>
+    </w:p>
+    <w:p>
+      <w:pPr>
+        <w:pStyle w:val="ListBullet"/>
+      </w:pPr>
+      <w:r>
+        <w:t>navigateFallbackDenylist: /api/, /swagger - Le richieste API e Swagger non vengono intercettate.</w:t>
+      </w:r>
+    </w:p>
+    <w:p>
+      <w:pPr>
+        <w:pStyle w:val="ListBullet"/>
+      </w:pPr>
+      <w:r>
+        <w:t>Controllo aggiornamenti: Ogni 5 minuti (setInterval) + ad ogni cambio pagina (Layout.jsx).</w:t>
+      </w:r>
+    </w:p>
+    <w:p>
+      <w:pPr>
+        <w:pStyle w:val="Heading3"/>
+      </w:pPr>
+      <w:r>
+        <w:t>12.3.3 Strategie di Caching Runtime</w:t>
+      </w:r>
+    </w:p>
+    <w:p>
+      <w:r>
+        <w:t>Il Service Worker implementa 6 strategie di caching differenziate per tipo di risorsa:</w:t>
+      </w:r>
+    </w:p>
+    <w:tbl>
+      <w:tblPr>
+        <w:tblStyle w:val="TableGrid"/>
+        <w:tblW w:type="auto" w:w="0"/>
+        <w:jc w:val="center"/>
+        <w:tblLook w:firstColumn="1" w:firstRow="1" w:lastColumn="0" w:lastRow="0" w:noHBand="0" w:noVBand="1" w:val="04A0"/>
+      </w:tblPr>
+      <w:tblGrid>
+        <w:gridCol w:w="1728"/>
+        <w:gridCol w:w="1728"/>
+        <w:gridCol w:w="1728"/>
+        <w:gridCol w:w="1728"/>
+        <w:gridCol w:w="1728"/>
+      </w:tblGrid>
+      <w:tr>
+        <w:tc>
+          <w:tcPr>
+            <w:tcW w:type="dxa" w:w="1417"/>
+            <w:shd w:fill="1e40af"/>
+          </w:tcPr>
+          <w:p>
+            <w:r>
+              <w:rPr>
+                <w:b/>
+                <w:color w:val="FFFFFF"/>
+                <w:sz w:val="20"/>
+              </w:rPr>
+              <w:t>Cache Name</w:t>
+            </w:r>
+          </w:p>
+        </w:tc>
+        <w:tc>
+          <w:tcPr>
+            <w:tcW w:type="dxa" w:w="1417"/>
+            <w:shd w:fill="1e40af"/>
+          </w:tcPr>
+          <w:p>
+            <w:r>
+              <w:rPr>
+                <w:b/>
+                <w:color w:val="FFFFFF"/>
+                <w:sz w:val="20"/>
+              </w:rPr>
+              <w:t>Strategia</w:t>
+            </w:r>
+          </w:p>
+        </w:tc>
+        <w:tc>
+          <w:tcPr>
+            <w:tcW w:type="dxa" w:w="1701"/>
+            <w:shd w:fill="1e40af"/>
+          </w:tcPr>
+          <w:p>
+            <w:r>
+              <w:rPr>
+                <w:b/>
+                <w:color w:val="FFFFFF"/>
+                <w:sz w:val="20"/>
+              </w:rPr>
+              <w:t>URL Pattern</w:t>
+            </w:r>
+          </w:p>
+        </w:tc>
+        <w:tc>
+          <w:tcPr>
+            <w:tcW w:type="dxa" w:w="1417"/>
+            <w:shd w:fill="1e40af"/>
+          </w:tcPr>
+          <w:p>
+            <w:r>
+              <w:rPr>
+                <w:b/>
+                <w:color w:val="FFFFFF"/>
+                <w:sz w:val="20"/>
+              </w:rPr>
+              <w:t>Scadenza</w:t>
+            </w:r>
+          </w:p>
+        </w:tc>
+        <w:tc>
+          <w:tcPr>
+            <w:tcW w:type="dxa" w:w="2268"/>
+            <w:shd w:fill="1e40af"/>
+          </w:tcPr>
+          <w:p>
+            <w:r>
+              <w:rPr>
+                <w:b/>
+                <w:color w:val="FFFFFF"/>
+                <w:sz w:val="20"/>
+              </w:rPr>
+              <w:t>Descrizione</w:t>
+            </w:r>
+          </w:p>
+        </w:tc>
+      </w:tr>
+      <w:tr>
+        <w:tc>
+          <w:tcPr>
+            <w:tcW w:type="dxa" w:w="1417"/>
+          </w:tcPr>
+          <w:p>
+            <w:r>
+              <w:rPr>
+                <w:sz w:val="20"/>
+              </w:rPr>
+              <w:t>products-cache</w:t>
+            </w:r>
+          </w:p>
+        </w:tc>
+        <w:tc>
+          <w:tcPr>
+            <w:tcW w:type="dxa" w:w="1417"/>
+          </w:tcPr>
+          <w:p>
+            <w:r>
+              <w:rPr>
+                <w:sz w:val="20"/>
+              </w:rPr>
+              <w:t>StaleWhileRevalidate</w:t>
+            </w:r>
+          </w:p>
+        </w:tc>
+        <w:tc>
+          <w:tcPr>
+            <w:tcW w:type="dxa" w:w="1701"/>
+          </w:tcPr>
+          <w:p>
+            <w:r>
+              <w:rPr>
+                <w:sz w:val="20"/>
+              </w:rPr>
+              <w:t>/api/prodotti</w:t>
+            </w:r>
+          </w:p>
+        </w:tc>
+        <w:tc>
+          <w:tcPr>
+            <w:tcW w:type="dxa" w:w="1417"/>
+          </w:tcPr>
+          <w:p>
+            <w:r>
+              <w:rPr>
+                <w:sz w:val="20"/>
+              </w:rPr>
+              <w:t>100 entries, 1h</w:t>
+            </w:r>
+          </w:p>
+        </w:tc>
+        <w:tc>
+          <w:tcPr>
+            <w:tcW w:type="dxa" w:w="2268"/>
+          </w:tcPr>
+          <w:p>
+            <w:r>
+              <w:rPr>
+                <w:sz w:val="20"/>
+              </w:rPr>
+              <w:t>Mostra cache, aggiorna in background</w:t>
+            </w:r>
+          </w:p>
+        </w:tc>
+      </w:tr>
+      <w:tr>
+        <w:tc>
+          <w:tcPr>
+            <w:tcW w:type="dxa" w:w="1417"/>
+          </w:tcPr>
+          <w:p>
+            <w:r>
+              <w:rPr>
+                <w:sz w:val="20"/>
+              </w:rPr>
+              <w:t>api-critical-cache</w:t>
+            </w:r>
+          </w:p>
+        </w:tc>
+        <w:tc>
+          <w:tcPr>
+            <w:tcW w:type="dxa" w:w="1417"/>
+          </w:tcPr>
+          <w:p>
+            <w:r>
+              <w:rPr>
+                <w:sz w:val="20"/>
+              </w:rPr>
+              <w:t>NetworkFirst (5s timeout)</w:t>
+            </w:r>
+          </w:p>
+        </w:tc>
+        <w:tc>
+          <w:tcPr>
+            <w:tcW w:type="dxa" w:w="1701"/>
+          </w:tcPr>
+          <w:p>
+            <w:r>
+              <w:rPr>
+                <w:sz w:val="20"/>
+              </w:rPr>
+              <w:t>/api/ordini, /api/auth</w:t>
+            </w:r>
+          </w:p>
+        </w:tc>
+        <w:tc>
+          <w:tcPr>
+            <w:tcW w:type="dxa" w:w="1417"/>
+          </w:tcPr>
+          <w:p>
+            <w:r>
+              <w:rPr>
+                <w:sz w:val="20"/>
+              </w:rPr>
+              <w:t>50 entries, 5min</w:t>
+            </w:r>
+          </w:p>
+        </w:tc>
+        <w:tc>
+          <w:tcPr>
+            <w:tcW w:type="dxa" w:w="2268"/>
+          </w:tcPr>
+          <w:p>
+            <w:r>
+              <w:rPr>
+                <w:sz w:val="20"/>
+              </w:rPr>
+              <w:t>Rete prima, fallback cache</w:t>
+            </w:r>
+          </w:p>
+        </w:tc>
+      </w:tr>
+      <w:tr>
+        <w:tc>
+          <w:tcPr>
+            <w:tcW w:type="dxa" w:w="1417"/>
+          </w:tcPr>
+          <w:p>
+            <w:r>
+              <w:rPr>
+                <w:sz w:val="20"/>
+              </w:rPr>
+              <w:t>pricelist-cache</w:t>
+            </w:r>
+          </w:p>
+        </w:tc>
+        <w:tc>
+          <w:tcPr>
+            <w:tcW w:type="dxa" w:w="1417"/>
+          </w:tcPr>
+          <w:p>
+            <w:r>
+              <w:rPr>
+                <w:sz w:val="20"/>
+              </w:rPr>
+              <w:t>StaleWhileRevalidate</w:t>
+            </w:r>
+          </w:p>
+        </w:tc>
+        <w:tc>
+          <w:tcPr>
+            <w:tcW w:type="dxa" w:w="1701"/>
+          </w:tcPr>
+          <w:p>
+            <w:r>
+              <w:rPr>
+                <w:sz w:val="20"/>
+              </w:rPr>
+              <w:t>/api/listini</w:t>
+            </w:r>
+          </w:p>
+        </w:tc>
+        <w:tc>
+          <w:tcPr>
+            <w:tcW w:type="dxa" w:w="1417"/>
+          </w:tcPr>
+          <w:p>
+            <w:r>
+              <w:rPr>
+                <w:sz w:val="20"/>
+              </w:rPr>
+              <w:t>50 entries, 30min</w:t>
+            </w:r>
+          </w:p>
+        </w:tc>
+        <w:tc>
+          <w:tcPr>
+            <w:tcW w:type="dxa" w:w="2268"/>
+          </w:tcPr>
+          <w:p>
+            <w:r>
+              <w:rPr>
+                <w:sz w:val="20"/>
+              </w:rPr>
+              <w:t>Cache con aggiornamento background</w:t>
+            </w:r>
+          </w:p>
+        </w:tc>
+      </w:tr>
+      <w:tr>
+        <w:tc>
+          <w:tcPr>
+            <w:tcW w:type="dxa" w:w="1417"/>
+          </w:tcPr>
+          <w:p>
+            <w:r>
+              <w:rPr>
+                <w:sz w:val="20"/>
+              </w:rPr>
+              <w:t>(health)</w:t>
+            </w:r>
+          </w:p>
+        </w:tc>
+        <w:tc>
+          <w:tcPr>
+            <w:tcW w:type="dxa" w:w="1417"/>
+          </w:tcPr>
+          <w:p>
+            <w:r>
+              <w:rPr>
+                <w:sz w:val="20"/>
+              </w:rPr>
+              <w:t>NetworkOnly</w:t>
+            </w:r>
+          </w:p>
+        </w:tc>
+        <w:tc>
+          <w:tcPr>
+            <w:tcW w:type="dxa" w:w="1701"/>
+          </w:tcPr>
+          <w:p>
+            <w:r>
+              <w:rPr>
+                <w:sz w:val="20"/>
+              </w:rPr>
+              <w:t>/api/health</w:t>
+            </w:r>
+          </w:p>
+        </w:tc>
+        <w:tc>
+          <w:tcPr>
+            <w:tcW w:type="dxa" w:w="1417"/>
+          </w:tcPr>
+          <w:p>
+            <w:r>
+              <w:rPr>
+                <w:sz w:val="20"/>
+              </w:rPr>
+              <w:t>-</w:t>
+            </w:r>
+          </w:p>
+        </w:tc>
+        <w:tc>
+          <w:tcPr>
+            <w:tcW w:type="dxa" w:w="2268"/>
+          </w:tcPr>
+          <w:p>
+            <w:r>
+              <w:rPr>
+                <w:sz w:val="20"/>
+              </w:rPr>
+              <w:t>Sempre dalla rete</w:t>
+            </w:r>
+          </w:p>
+        </w:tc>
+      </w:tr>
+      <w:tr>
+        <w:tc>
+          <w:tcPr>
+            <w:tcW w:type="dxa" w:w="1417"/>
+          </w:tcPr>
+          <w:p>
+            <w:r>
+              <w:rPr>
+                <w:sz w:val="20"/>
+              </w:rPr>
+              <w:t>images-cache</w:t>
+            </w:r>
+          </w:p>
+        </w:tc>
+        <w:tc>
+          <w:tcPr>
+            <w:tcW w:type="dxa" w:w="1417"/>
+          </w:tcPr>
+          <w:p>
+            <w:r>
+              <w:rPr>
+                <w:sz w:val="20"/>
+              </w:rPr>
+              <w:t>CacheFirst</w:t>
+            </w:r>
+          </w:p>
+        </w:tc>
+        <w:tc>
+          <w:tcPr>
+            <w:tcW w:type="dxa" w:w="1701"/>
+          </w:tcPr>
+          <w:p>
+            <w:r>
+              <w:rPr>
+                <w:sz w:val="20"/>
+              </w:rPr>
+              <w:t>.png/.jpg/.svg/.webp</w:t>
+            </w:r>
+          </w:p>
+        </w:tc>
+        <w:tc>
+          <w:tcPr>
+            <w:tcW w:type="dxa" w:w="1417"/>
+          </w:tcPr>
+          <w:p>
+            <w:r>
+              <w:rPr>
+                <w:sz w:val="20"/>
+              </w:rPr>
+              <w:t>50 entries, 30gg</w:t>
+            </w:r>
+          </w:p>
+        </w:tc>
+        <w:tc>
+          <w:tcPr>
+            <w:tcW w:type="dxa" w:w="2268"/>
+          </w:tcPr>
+          <w:p>
+            <w:r>
+              <w:rPr>
+                <w:sz w:val="20"/>
+              </w:rPr>
+              <w:t>Immagini statiche</w:t>
+            </w:r>
+          </w:p>
+        </w:tc>
+      </w:tr>
+      <w:tr>
+        <w:tc>
+          <w:tcPr>
+            <w:tcW w:type="dxa" w:w="1417"/>
+          </w:tcPr>
+          <w:p>
+            <w:r>
+              <w:rPr>
+                <w:sz w:val="20"/>
+              </w:rPr>
+              <w:t>fonts-cache</w:t>
+            </w:r>
+          </w:p>
+        </w:tc>
+        <w:tc>
+          <w:tcPr>
+            <w:tcW w:type="dxa" w:w="1417"/>
+          </w:tcPr>
+          <w:p>
+            <w:r>
+              <w:rPr>
+                <w:sz w:val="20"/>
+              </w:rPr>
+              <w:t>CacheFirst</w:t>
+            </w:r>
+          </w:p>
+        </w:tc>
+        <w:tc>
+          <w:tcPr>
+            <w:tcW w:type="dxa" w:w="1701"/>
+          </w:tcPr>
+          <w:p>
+            <w:r>
+              <w:rPr>
+                <w:sz w:val="20"/>
+              </w:rPr>
+              <w:t>.woff/.woff2/.ttf</w:t>
+            </w:r>
+          </w:p>
+        </w:tc>
+        <w:tc>
+          <w:tcPr>
+            <w:tcW w:type="dxa" w:w="1417"/>
+          </w:tcPr>
+          <w:p>
+            <w:r>
+              <w:rPr>
+                <w:sz w:val="20"/>
+              </w:rPr>
+              <w:t>10 entries, 1 anno</w:t>
+            </w:r>
+          </w:p>
+        </w:tc>
+        <w:tc>
+          <w:tcPr>
+            <w:tcW w:type="dxa" w:w="2268"/>
+          </w:tcPr>
+          <w:p>
+            <w:r>
+              <w:rPr>
+                <w:sz w:val="20"/>
+              </w:rPr>
+              <w:t>Web fonts</w:t>
+            </w:r>
+          </w:p>
+        </w:tc>
+      </w:tr>
+    </w:tbl>
+    <w:p>
+      <w:pPr>
+        <w:pStyle w:val="Heading3"/>
+      </w:pPr>
+      <w:r>
+        <w:t>12.3.4 Componenti PWA Frontend</w:t>
+      </w:r>
+    </w:p>
+    <w:p>
+      <w:pPr>
+        <w:pStyle w:val="ListBullet"/>
+      </w:pPr>
+      <w:r>
+        <w:t>InstallPrompt.jsx: Banner di installazione (blu, in basso) che intercetta l'evento beforeinstallprompt del browser. Presenta pulsanti "Installa" e "Non ora". Se dismissato, non riappare per 7 giorni (localStorage). Si nasconde automaticamente dopo l'evento appinstalled.</w:t>
+      </w:r>
+    </w:p>
+    <w:p>
+      <w:pPr>
+        <w:pStyle w:val="ListBullet"/>
+      </w:pPr>
+      <w:r>
+        <w:t>UpdatePrompt.jsx: Banner di aggiornamento (ambra, in alto) che ascolta l'evento custom pwa-update-available emesso da main.jsx. Pulsanti "Aggiorna ora" (chiama window.__PWA_UPDATE_SW(true)) e "Piu tardi". Fallback con window.location.reload() dopo 500ms.</w:t>
+      </w:r>
+    </w:p>
+    <w:p>
+      <w:pPr>
+        <w:pStyle w:val="ListBullet"/>
+      </w:pPr>
+      <w:r>
+        <w:t>OfflineBanner.jsx: Banner rosso sottile mostrato automaticamente quando la connessione cade. Usa l'hook useOnlineStatus che monitora gli eventi online/offline del browser. Si nasconde quando la connessione ritorna.</w:t>
+      </w:r>
+    </w:p>
+    <w:p>
+      <w:pPr>
+        <w:pStyle w:val="ListBullet"/>
+      </w:pPr>
+      <w:r>
+        <w:t>OfflinePage.jsx: Pagina di fallback (route /offline) con icona WiFi spento, messaggio localizzato e pulsante "Riprova" che ricarica la pagina. Raggiungibile quando l'utente accede a risorse non in cache senza connessione.</w:t>
+      </w:r>
+    </w:p>
+    <w:p>
+      <w:pPr>
+        <w:pStyle w:val="ListBullet"/>
+      </w:pPr>
+      <w:r>
+        <w:t>ChunkErrorBoundary (App.jsx): Error Boundary React che intercetta errori di caricamento chunk JavaScript obsoleti (ChunkLoadError, Failed to fetch dynamically imported module). Forza un reload dalla rete con protezione anti-loop (max 1 reload ogni 10 secondi tramite sessionStorage).</w:t>
+      </w:r>
+    </w:p>
+    <w:p>
+      <w:pPr>
+        <w:pStyle w:val="ListBullet"/>
+      </w:pPr>
+      <w:r>
+        <w:t>useOnlineStatus hook: Hook custom che monitora navigator.onLine e gli eventi online/offline del browser. Restituisce un booleano reattivo usato da OfflineBanner.</w:t>
+      </w:r>
+    </w:p>
+    <w:p>
+      <w:pPr>
+        <w:pStyle w:val="Heading3"/>
+      </w:pPr>
+      <w:r>
+        <w:t>12.3.5 Meta Tags HTML per PWA</w:t>
+      </w:r>
+    </w:p>
+    <w:p>
+      <w:r>
+        <w:t>Il file index.html include i meta tag necessari per il supporto PWA su tutti i browser:</w:t>
+      </w:r>
+    </w:p>
+    <w:p>
+      <w:pPr>
+        <w:pStyle w:val="ListBullet"/>
+      </w:pPr>
+      <w:r>
+        <w:t>theme-color: #2563eb (colore barra del browser)</w:t>
+      </w:r>
+    </w:p>
+    <w:p>
+      <w:pPr>
+        <w:pStyle w:val="ListBullet"/>
+      </w:pPr>
+      <w:r>
+        <w:t>apple-mobile-web-app-capable: yes (supporto iOS standalone)</w:t>
+      </w:r>
+    </w:p>
+    <w:p>
+      <w:pPr>
+        <w:pStyle w:val="ListBullet"/>
+      </w:pPr>
+      <w:r>
+        <w:t>apple-mobile-web-app-status-bar-style: black-translucent (stile barra di stato iOS)</w:t>
+      </w:r>
+    </w:p>
+    <w:p>
+      <w:pPr>
+        <w:pStyle w:val="ListBullet"/>
+      </w:pPr>
+      <w:r>
+        <w:t>apple-mobile-web-app-title: Recinzioni (titolo su iOS)</w:t>
+      </w:r>
+    </w:p>
+    <w:p>
+      <w:pPr>
+        <w:pStyle w:val="ListBullet"/>
+      </w:pPr>
+      <w:r>
+        <w:t>apple-touch-icon: /apple-touch-icon.png (icona 180x180 per iOS)</w:t>
+      </w:r>
+    </w:p>
+    <w:p>
+      <w:pPr>
+        <w:pStyle w:val="ListBullet"/>
+      </w:pPr>
+      <w:r>
+        <w:t>Asset in public/: favicon.ico, favicon.svg, apple-touch-icon.png, logo-192.png, logo-512.png</w:t>
+      </w:r>
+    </w:p>
+    <w:p>
+      <w:pPr>
+        <w:pStyle w:val="Heading3"/>
+      </w:pPr>
+      <w:r>
+        <w:t>12.3.6 Traduzioni PWA</w:t>
+      </w:r>
+    </w:p>
+    <w:p>
+      <w:r>
+        <w:t>Tutte le 12 stringhe PWA sono localizzate in 4 lingue (IT, EN, FR, DE) nei file i18n sotto la chiave "pwa". Le chiavi coprono: installTitle, installMessage, installButton, dismissButton, offlineTitle, offlineMessage, offlineRetry, offlineLimited, updateAvailable, updateMessage, updateButton, updateDismiss.</w:t>
       </w:r>
     </w:p>
     <w:p>

</xml_diff>

<commit_message>
Add dark/light mode toggle, fix blank page on first load, update Legge Stanca compliance
- Add useThemeStore (Zustand) with localStorage persistence and prefers-color-scheme listener
- Add Sun/Moon toggle button in sidebar (Layout.jsx) and login page
- Add dark: Tailwind prefixes to all 23 components and pages for full dark mode support
- Add theme i18n translations in all 4 languages (IT, EN, FR, DE)
- Fix blank page on first load: add no-cache headers for index.html in Program.cs middleware,
  StaticFileOptions, and web.config IIS rules to prevent stale HTML caching after deploy
- Update accessibility section in docs for Legge Stanca (L. 4/2004) / WCAG 2.1 AA compliance
- Update DOCUMENTAZIONE_TECNICA.md with dark mode architecture, color mapping, and caching fix
- Regenerate ANALISI_FUNZIONALE.docx with expanded accessibility and dark mode sections

https://claude.ai/code/session_01E5gZhwQEeN7zfSCsTAgeNT
</commit_message>
<xml_diff>
--- a/ANALISI_FUNZIONALE.docx
+++ b/ANALISI_FUNZIONALE.docx
@@ -6606,28 +6606,465 @@
         <w:pStyle w:val="Heading2"/>
       </w:pPr>
       <w:r>
-        <w:t>12.2 Accessibilita (WCAG 2.1 AA)</w:t>
+        <w:t>12.2 Accessibilita (WCAG 2.1 AA / Legge Stanca)</w:t>
       </w:r>
     </w:p>
     <w:p>
       <w:r>
-        <w:t>L'applicazione implementa le seguenti caratteristiche di accessibilita:</w:t>
+        <w:t>L'applicazione e conforme ai requisiti della Legge 9 gennaio 2004, n. 4 (Legge Stanca) allineati a WCAG 2.1 livello AA (AgID, Determinazione 437/2020). Dal 28 giugno 2025 l'European Accessibility Act (Direttiva UE 2019/882) estende gli obblighi anche alle imprese private con fatturato &gt;2M EUR e &gt;10 dipendenti.</w:t>
       </w:r>
     </w:p>
     <w:p>
       <w:pPr>
-        <w:pStyle w:val="ListBullet"/>
+        <w:pStyle w:val="Heading3"/>
       </w:pPr>
       <w:r>
-        <w:t>Skip Links: Link di salto al contenuto principale, visibili al focus da tastiera.</w:t>
+        <w:t>12.2.1 Criteri WCAG implementati</w:t>
+      </w:r>
+    </w:p>
+    <w:tbl>
+      <w:tblPr>
+        <w:tblStyle w:val="TableGrid"/>
+        <w:tblW w:type="auto" w:w="0"/>
+        <w:jc w:val="center"/>
+        <w:tblLook w:firstColumn="1" w:firstRow="1" w:lastColumn="0" w:lastRow="0" w:noHBand="0" w:noVBand="1" w:val="04A0"/>
+      </w:tblPr>
+      <w:tblGrid>
+        <w:gridCol w:w="2880"/>
+        <w:gridCol w:w="2880"/>
+        <w:gridCol w:w="2880"/>
+      </w:tblGrid>
+      <w:tr>
+        <w:tc>
+          <w:tcPr>
+            <w:tcW w:type="dxa" w:w="1134"/>
+            <w:shd w:fill="1e40af"/>
+          </w:tcPr>
+          <w:p>
+            <w:r>
+              <w:rPr>
+                <w:b/>
+                <w:color w:val="FFFFFF"/>
+                <w:sz w:val="20"/>
+              </w:rPr>
+              <w:t>Criterio WCAG</w:t>
+            </w:r>
+          </w:p>
+        </w:tc>
+        <w:tc>
+          <w:tcPr>
+            <w:tcW w:type="dxa" w:w="1701"/>
+            <w:shd w:fill="1e40af"/>
+          </w:tcPr>
+          <w:p>
+            <w:r>
+              <w:rPr>
+                <w:b/>
+                <w:color w:val="FFFFFF"/>
+                <w:sz w:val="20"/>
+              </w:rPr>
+              <w:t>Requisito</w:t>
+            </w:r>
+          </w:p>
+        </w:tc>
+        <w:tc>
+          <w:tcPr>
+            <w:tcW w:type="dxa" w:w="4535"/>
+            <w:shd w:fill="1e40af"/>
+          </w:tcPr>
+          <w:p>
+            <w:r>
+              <w:rPr>
+                <w:b/>
+                <w:color w:val="FFFFFF"/>
+                <w:sz w:val="20"/>
+              </w:rPr>
+              <w:t>Implementazione</w:t>
+            </w:r>
+          </w:p>
+        </w:tc>
+      </w:tr>
+      <w:tr>
+        <w:tc>
+          <w:tcPr>
+            <w:tcW w:type="dxa" w:w="1134"/>
+          </w:tcPr>
+          <w:p>
+            <w:r>
+              <w:rPr>
+                <w:sz w:val="20"/>
+              </w:rPr>
+              <w:t>1.3.1</w:t>
+            </w:r>
+          </w:p>
+        </w:tc>
+        <w:tc>
+          <w:tcPr>
+            <w:tcW w:type="dxa" w:w="1701"/>
+          </w:tcPr>
+          <w:p>
+            <w:r>
+              <w:rPr>
+                <w:sz w:val="20"/>
+              </w:rPr>
+              <w:t>Info e Relazioni</w:t>
+            </w:r>
+          </w:p>
+        </w:tc>
+        <w:tc>
+          <w:tcPr>
+            <w:tcW w:type="dxa" w:w="4535"/>
+          </w:tcPr>
+          <w:p>
+            <w:r>
+              <w:rPr>
+                <w:sz w:val="20"/>
+              </w:rPr>
+              <w:t>Tabelle con scope="col", label con htmlFor, gerarchia heading</w:t>
+            </w:r>
+          </w:p>
+        </w:tc>
+      </w:tr>
+      <w:tr>
+        <w:tc>
+          <w:tcPr>
+            <w:tcW w:type="dxa" w:w="1134"/>
+          </w:tcPr>
+          <w:p>
+            <w:r>
+              <w:rPr>
+                <w:sz w:val="20"/>
+              </w:rPr>
+              <w:t>1.4.3</w:t>
+            </w:r>
+          </w:p>
+        </w:tc>
+        <w:tc>
+          <w:tcPr>
+            <w:tcW w:type="dxa" w:w="1701"/>
+          </w:tcPr>
+          <w:p>
+            <w:r>
+              <w:rPr>
+                <w:sz w:val="20"/>
+              </w:rPr>
+              <w:t>Contrasto minimo 4.5:1</w:t>
+            </w:r>
+          </w:p>
+        </w:tc>
+        <w:tc>
+          <w:tcPr>
+            <w:tcW w:type="dxa" w:w="4535"/>
+          </w:tcPr>
+          <w:p>
+            <w:r>
+              <w:rPr>
+                <w:sz w:val="20"/>
+              </w:rPr>
+              <w:t>primary-700+ per testo su sfondo chiaro, gray-100/200 su scuro</w:t>
+            </w:r>
+          </w:p>
+        </w:tc>
+      </w:tr>
+      <w:tr>
+        <w:tc>
+          <w:tcPr>
+            <w:tcW w:type="dxa" w:w="1134"/>
+          </w:tcPr>
+          <w:p>
+            <w:r>
+              <w:rPr>
+                <w:sz w:val="20"/>
+              </w:rPr>
+              <w:t>1.4.11</w:t>
+            </w:r>
+          </w:p>
+        </w:tc>
+        <w:tc>
+          <w:tcPr>
+            <w:tcW w:type="dxa" w:w="1701"/>
+          </w:tcPr>
+          <w:p>
+            <w:r>
+              <w:rPr>
+                <w:sz w:val="20"/>
+              </w:rPr>
+              <w:t>Contrasto non-testo</w:t>
+            </w:r>
+          </w:p>
+        </w:tc>
+        <w:tc>
+          <w:tcPr>
+            <w:tcW w:type="dxa" w:w="4535"/>
+          </w:tcPr>
+          <w:p>
+            <w:r>
+              <w:rPr>
+                <w:sz w:val="20"/>
+              </w:rPr>
+              <w:t>@media (forced-colors: active) con bordi espliciti</w:t>
+            </w:r>
+          </w:p>
+        </w:tc>
+      </w:tr>
+      <w:tr>
+        <w:tc>
+          <w:tcPr>
+            <w:tcW w:type="dxa" w:w="1134"/>
+          </w:tcPr>
+          <w:p>
+            <w:r>
+              <w:rPr>
+                <w:sz w:val="20"/>
+              </w:rPr>
+              <w:t>2.1.1</w:t>
+            </w:r>
+          </w:p>
+        </w:tc>
+        <w:tc>
+          <w:tcPr>
+            <w:tcW w:type="dxa" w:w="1701"/>
+          </w:tcPr>
+          <w:p>
+            <w:r>
+              <w:rPr>
+                <w:sz w:val="20"/>
+              </w:rPr>
+              <w:t>Accesso da tastiera</w:t>
+            </w:r>
+          </w:p>
+        </w:tc>
+        <w:tc>
+          <w:tcPr>
+            <w:tcW w:type="dxa" w:w="4535"/>
+          </w:tcPr>
+          <w:p>
+            <w:r>
+              <w:rPr>
+                <w:sz w:val="20"/>
+              </w:rPr>
+              <w:t>Tutti i controlli sono &lt;button&gt; o &lt;a&gt;, nessun onClick su div</w:t>
+            </w:r>
+          </w:p>
+        </w:tc>
+      </w:tr>
+      <w:tr>
+        <w:tc>
+          <w:tcPr>
+            <w:tcW w:type="dxa" w:w="1134"/>
+          </w:tcPr>
+          <w:p>
+            <w:r>
+              <w:rPr>
+                <w:sz w:val="20"/>
+              </w:rPr>
+              <w:t>2.4.1</w:t>
+            </w:r>
+          </w:p>
+        </w:tc>
+        <w:tc>
+          <w:tcPr>
+            <w:tcW w:type="dxa" w:w="1701"/>
+          </w:tcPr>
+          <w:p>
+            <w:r>
+              <w:rPr>
+                <w:sz w:val="20"/>
+              </w:rPr>
+              <w:t>Salta blocchi</w:t>
+            </w:r>
+          </w:p>
+        </w:tc>
+        <w:tc>
+          <w:tcPr>
+            <w:tcW w:type="dxa" w:w="4535"/>
+          </w:tcPr>
+          <w:p>
+            <w:r>
+              <w:rPr>
+                <w:sz w:val="20"/>
+              </w:rPr>
+              <w:t>SkipLinks.jsx: "Vai al contenuto" e "Vai alla navigazione"</w:t>
+            </w:r>
+          </w:p>
+        </w:tc>
+      </w:tr>
+      <w:tr>
+        <w:tc>
+          <w:tcPr>
+            <w:tcW w:type="dxa" w:w="1134"/>
+          </w:tcPr>
+          <w:p>
+            <w:r>
+              <w:rPr>
+                <w:sz w:val="20"/>
+              </w:rPr>
+              <w:t>2.4.7</w:t>
+            </w:r>
+          </w:p>
+        </w:tc>
+        <w:tc>
+          <w:tcPr>
+            <w:tcW w:type="dxa" w:w="1701"/>
+          </w:tcPr>
+          <w:p>
+            <w:r>
+              <w:rPr>
+                <w:sz w:val="20"/>
+              </w:rPr>
+              <w:t>Focus visibile</w:t>
+            </w:r>
+          </w:p>
+        </w:tc>
+        <w:tc>
+          <w:tcPr>
+            <w:tcW w:type="dxa" w:w="4535"/>
+          </w:tcPr>
+          <w:p>
+            <w:r>
+              <w:rPr>
+                <w:sz w:val="20"/>
+              </w:rPr>
+              <w:t>*:focus-visible con outline primary-500, ring sui pulsanti</w:t>
+            </w:r>
+          </w:p>
+        </w:tc>
+      </w:tr>
+      <w:tr>
+        <w:tc>
+          <w:tcPr>
+            <w:tcW w:type="dxa" w:w="1134"/>
+          </w:tcPr>
+          <w:p>
+            <w:r>
+              <w:rPr>
+                <w:sz w:val="20"/>
+              </w:rPr>
+              <w:t>2.5.5</w:t>
+            </w:r>
+          </w:p>
+        </w:tc>
+        <w:tc>
+          <w:tcPr>
+            <w:tcW w:type="dxa" w:w="1701"/>
+          </w:tcPr>
+          <w:p>
+            <w:r>
+              <w:rPr>
+                <w:sz w:val="20"/>
+              </w:rPr>
+              <w:t>Dimensione target</w:t>
+            </w:r>
+          </w:p>
+        </w:tc>
+        <w:tc>
+          <w:tcPr>
+            <w:tcW w:type="dxa" w:w="4535"/>
+          </w:tcPr>
+          <w:p>
+            <w:r>
+              <w:rPr>
+                <w:sz w:val="20"/>
+              </w:rPr>
+              <w:t>Pulsanti min 44x44px o spaziatura adeguata</w:t>
+            </w:r>
+          </w:p>
+        </w:tc>
+      </w:tr>
+      <w:tr>
+        <w:tc>
+          <w:tcPr>
+            <w:tcW w:type="dxa" w:w="1134"/>
+          </w:tcPr>
+          <w:p>
+            <w:r>
+              <w:rPr>
+                <w:sz w:val="20"/>
+              </w:rPr>
+              <w:t>3.1.1</w:t>
+            </w:r>
+          </w:p>
+        </w:tc>
+        <w:tc>
+          <w:tcPr>
+            <w:tcW w:type="dxa" w:w="1701"/>
+          </w:tcPr>
+          <w:p>
+            <w:r>
+              <w:rPr>
+                <w:sz w:val="20"/>
+              </w:rPr>
+              <w:t>Lingua pagina</w:t>
+            </w:r>
+          </w:p>
+        </w:tc>
+        <w:tc>
+          <w:tcPr>
+            <w:tcW w:type="dxa" w:w="4535"/>
+          </w:tcPr>
+          <w:p>
+            <w:r>
+              <w:rPr>
+                <w:sz w:val="20"/>
+              </w:rPr>
+              <w:t>&lt;html lang&gt; sincronizzato con i18n.language</w:t>
+            </w:r>
+          </w:p>
+        </w:tc>
+      </w:tr>
+      <w:tr>
+        <w:tc>
+          <w:tcPr>
+            <w:tcW w:type="dxa" w:w="1134"/>
+          </w:tcPr>
+          <w:p>
+            <w:r>
+              <w:rPr>
+                <w:sz w:val="20"/>
+              </w:rPr>
+              <w:t>2.3.3</w:t>
+            </w:r>
+          </w:p>
+        </w:tc>
+        <w:tc>
+          <w:tcPr>
+            <w:tcW w:type="dxa" w:w="1701"/>
+          </w:tcPr>
+          <w:p>
+            <w:r>
+              <w:rPr>
+                <w:sz w:val="20"/>
+              </w:rPr>
+              <w:t>Riduzione movimento</w:t>
+            </w:r>
+          </w:p>
+        </w:tc>
+        <w:tc>
+          <w:tcPr>
+            <w:tcW w:type="dxa" w:w="4535"/>
+          </w:tcPr>
+          <w:p>
+            <w:r>
+              <w:rPr>
+                <w:sz w:val="20"/>
+              </w:rPr>
+              <w:t>@media (prefers-reduced-motion: reduce)</w:t>
+            </w:r>
+          </w:p>
+        </w:tc>
+      </w:tr>
+    </w:tbl>
+    <w:p>
+      <w:pPr>
+        <w:pStyle w:val="Heading3"/>
+      </w:pPr>
+      <w:r>
+        <w:t>12.2.2 Dark Mode (Modalita Notturna)</w:t>
       </w:r>
     </w:p>
     <w:p>
-      <w:pPr>
-        <w:pStyle w:val="ListBullet"/>
-      </w:pPr>
       <w:r>
-        <w:t>Focus Trap: Nelle modali, il focus resta confinato all'interno della modale.</w:t>
+        <w:t>Il portale supporta una modalita chiara (default) e una modalita scura, attivabile per ogni utente tramite toggle nella sidebar o nella pagina di login.</w:t>
       </w:r>
     </w:p>
     <w:p>
@@ -6635,7 +7072,7 @@
         <w:pStyle w:val="ListBullet"/>
       </w:pPr>
       <w:r>
-        <w:t>Attributi ARIA: aria-label, aria-hidden, aria-expanded, aria-invalid su tutti gli elementi interattivi.</w:t>
+        <w:t>Strategia: Tailwind CSS darkMode: "class" - la classe "dark" su &lt;html&gt; attiva i prefissi dark:.</w:t>
       </w:r>
     </w:p>
     <w:p>
@@ -6643,7 +7080,7 @@
         <w:pStyle w:val="ListBullet"/>
       </w:pPr>
       <w:r>
-        <w:t>Icone decorative: Tutte le icone decorative hanno aria-hidden="true".</w:t>
+        <w:t>Store: useThemeStore (Zustand) gestisce theme, toggleTheme(), setTheme(), initTheme().</w:t>
       </w:r>
     </w:p>
     <w:p>
@@ -6651,7 +7088,7 @@
         <w:pStyle w:val="ListBullet"/>
       </w:pPr>
       <w:r>
-        <w:t>Tabelle: Uso di scope="col" sugli header delle tabelle.</w:t>
+        <w:t>Persistenza: localStorage con chiave "theme" (dark|light), sopravvive alla sessione.</w:t>
       </w:r>
     </w:p>
     <w:p>
@@ -6659,7 +7096,7 @@
         <w:pStyle w:val="ListBullet"/>
       </w:pPr>
       <w:r>
-        <w:t>Contrasto colori: Minimo rapporto 4.5:1 per testo su sfondo (primary-700 o superiore).</w:t>
+        <w:t>Preferenza sistema: Se l'utente non ha scelto, segue prefers-color-scheme del browser.</w:t>
       </w:r>
     </w:p>
     <w:p>
@@ -6667,7 +7104,7 @@
         <w:pStyle w:val="ListBullet"/>
       </w:pPr>
       <w:r>
-        <w:t>Configuratore accessibile: Componente testuale alternativo per la visualizzazione 3D.</w:t>
+        <w:t>Inizializzazione: initTheme() in App.jsx applica la classe "dark" prima del primo render.</w:t>
       </w:r>
     </w:p>
     <w:p>
@@ -6675,7 +7112,500 @@
         <w:pStyle w:val="ListBullet"/>
       </w:pPr>
       <w:r>
-        <w:t>Lingua documento: Attributo lang su &lt;html&gt; sincronizzato con la lingua corrente.</w:t>
+        <w:t>Toggle UI: Icona Sun/Moon nella sidebar (Layout.jsx) e nella login page (LoginPage.jsx).</w:t>
+      </w:r>
+    </w:p>
+    <w:p>
+      <w:pPr>
+        <w:pStyle w:val="ListBullet"/>
+      </w:pPr>
+      <w:r>
+        <w:t>i18n: Chiavi theme.light, theme.dark, theme.toggle in tutte e 4 le lingue (IT/EN/FR/DE).</w:t>
+      </w:r>
+    </w:p>
+    <w:p>
+      <w:pPr>
+        <w:pStyle w:val="ListBullet"/>
+      </w:pPr>
+      <w:r>
+        <w:t>Tutti i componenti e pagine utilizzano prefissi dark: per backgrounds, testi, bordi e hover.</w:t>
+      </w:r>
+    </w:p>
+    <w:p>
+      <w:pPr>
+        <w:pStyle w:val="Heading3"/>
+      </w:pPr>
+      <w:r>
+        <w:t>12.2.3 Mapping colori dark mode</w:t>
+      </w:r>
+    </w:p>
+    <w:tbl>
+      <w:tblPr>
+        <w:tblStyle w:val="TableGrid"/>
+        <w:tblW w:type="auto" w:w="0"/>
+        <w:jc w:val="center"/>
+        <w:tblLook w:firstColumn="1" w:firstRow="1" w:lastColumn="0" w:lastRow="0" w:noHBand="0" w:noVBand="1" w:val="04A0"/>
+      </w:tblPr>
+      <w:tblGrid>
+        <w:gridCol w:w="2880"/>
+        <w:gridCol w:w="2880"/>
+        <w:gridCol w:w="2880"/>
+      </w:tblGrid>
+      <w:tr>
+        <w:tc>
+          <w:tcPr>
+            <w:tcW w:type="dxa" w:w="1701"/>
+            <w:shd w:fill="1e40af"/>
+          </w:tcPr>
+          <w:p>
+            <w:r>
+              <w:rPr>
+                <w:b/>
+                <w:color w:val="FFFFFF"/>
+                <w:sz w:val="20"/>
+              </w:rPr>
+              <w:t>Classe Light</w:t>
+            </w:r>
+          </w:p>
+        </w:tc>
+        <w:tc>
+          <w:tcPr>
+            <w:tcW w:type="dxa" w:w="1701"/>
+            <w:shd w:fill="1e40af"/>
+          </w:tcPr>
+          <w:p>
+            <w:r>
+              <w:rPr>
+                <w:b/>
+                <w:color w:val="FFFFFF"/>
+                <w:sz w:val="20"/>
+              </w:rPr>
+              <w:t>Classe Dark</w:t>
+            </w:r>
+          </w:p>
+        </w:tc>
+        <w:tc>
+          <w:tcPr>
+            <w:tcW w:type="dxa" w:w="3969"/>
+            <w:shd w:fill="1e40af"/>
+          </w:tcPr>
+          <w:p>
+            <w:r>
+              <w:rPr>
+                <w:b/>
+                <w:color w:val="FFFFFF"/>
+                <w:sz w:val="20"/>
+              </w:rPr>
+              <w:t>Uso</w:t>
+            </w:r>
+          </w:p>
+        </w:tc>
+      </w:tr>
+      <w:tr>
+        <w:tc>
+          <w:tcPr>
+            <w:tcW w:type="dxa" w:w="1701"/>
+          </w:tcPr>
+          <w:p>
+            <w:r>
+              <w:rPr>
+                <w:sz w:val="20"/>
+              </w:rPr>
+              <w:t>bg-white</w:t>
+            </w:r>
+          </w:p>
+        </w:tc>
+        <w:tc>
+          <w:tcPr>
+            <w:tcW w:type="dxa" w:w="1701"/>
+          </w:tcPr>
+          <w:p>
+            <w:r>
+              <w:rPr>
+                <w:sz w:val="20"/>
+              </w:rPr>
+              <w:t>dark:bg-gray-800</w:t>
+            </w:r>
+          </w:p>
+        </w:tc>
+        <w:tc>
+          <w:tcPr>
+            <w:tcW w:type="dxa" w:w="3969"/>
+          </w:tcPr>
+          <w:p>
+            <w:r>
+              <w:rPr>
+                <w:sz w:val="20"/>
+              </w:rPr>
+              <w:t>Card, modali, input</w:t>
+            </w:r>
+          </w:p>
+        </w:tc>
+      </w:tr>
+      <w:tr>
+        <w:tc>
+          <w:tcPr>
+            <w:tcW w:type="dxa" w:w="1701"/>
+          </w:tcPr>
+          <w:p>
+            <w:r>
+              <w:rPr>
+                <w:sz w:val="20"/>
+              </w:rPr>
+              <w:t>bg-gray-50</w:t>
+            </w:r>
+          </w:p>
+        </w:tc>
+        <w:tc>
+          <w:tcPr>
+            <w:tcW w:type="dxa" w:w="1701"/>
+          </w:tcPr>
+          <w:p>
+            <w:r>
+              <w:rPr>
+                <w:sz w:val="20"/>
+              </w:rPr>
+              <w:t>dark:bg-gray-800/900</w:t>
+            </w:r>
+          </w:p>
+        </w:tc>
+        <w:tc>
+          <w:tcPr>
+            <w:tcW w:type="dxa" w:w="3969"/>
+          </w:tcPr>
+          <w:p>
+            <w:r>
+              <w:rPr>
+                <w:sz w:val="20"/>
+              </w:rPr>
+              <w:t>Sfondi sezione, table header</w:t>
+            </w:r>
+          </w:p>
+        </w:tc>
+      </w:tr>
+      <w:tr>
+        <w:tc>
+          <w:tcPr>
+            <w:tcW w:type="dxa" w:w="1701"/>
+          </w:tcPr>
+          <w:p>
+            <w:r>
+              <w:rPr>
+                <w:sz w:val="20"/>
+              </w:rPr>
+              <w:t>text-gray-900</w:t>
+            </w:r>
+          </w:p>
+        </w:tc>
+        <w:tc>
+          <w:tcPr>
+            <w:tcW w:type="dxa" w:w="1701"/>
+          </w:tcPr>
+          <w:p>
+            <w:r>
+              <w:rPr>
+                <w:sz w:val="20"/>
+              </w:rPr>
+              <w:t>dark:text-gray-100</w:t>
+            </w:r>
+          </w:p>
+        </w:tc>
+        <w:tc>
+          <w:tcPr>
+            <w:tcW w:type="dxa" w:w="3969"/>
+          </w:tcPr>
+          <w:p>
+            <w:r>
+              <w:rPr>
+                <w:sz w:val="20"/>
+              </w:rPr>
+              <w:t>Titoli principali</w:t>
+            </w:r>
+          </w:p>
+        </w:tc>
+      </w:tr>
+      <w:tr>
+        <w:tc>
+          <w:tcPr>
+            <w:tcW w:type="dxa" w:w="1701"/>
+          </w:tcPr>
+          <w:p>
+            <w:r>
+              <w:rPr>
+                <w:sz w:val="20"/>
+              </w:rPr>
+              <w:t>text-gray-700</w:t>
+            </w:r>
+          </w:p>
+        </w:tc>
+        <w:tc>
+          <w:tcPr>
+            <w:tcW w:type="dxa" w:w="1701"/>
+          </w:tcPr>
+          <w:p>
+            <w:r>
+              <w:rPr>
+                <w:sz w:val="20"/>
+              </w:rPr>
+              <w:t>dark:text-gray-300</w:t>
+            </w:r>
+          </w:p>
+        </w:tc>
+        <w:tc>
+          <w:tcPr>
+            <w:tcW w:type="dxa" w:w="3969"/>
+          </w:tcPr>
+          <w:p>
+            <w:r>
+              <w:rPr>
+                <w:sz w:val="20"/>
+              </w:rPr>
+              <w:t>Label, testo secondario</w:t>
+            </w:r>
+          </w:p>
+        </w:tc>
+      </w:tr>
+      <w:tr>
+        <w:tc>
+          <w:tcPr>
+            <w:tcW w:type="dxa" w:w="1701"/>
+          </w:tcPr>
+          <w:p>
+            <w:r>
+              <w:rPr>
+                <w:sz w:val="20"/>
+              </w:rPr>
+              <w:t>text-gray-500</w:t>
+            </w:r>
+          </w:p>
+        </w:tc>
+        <w:tc>
+          <w:tcPr>
+            <w:tcW w:type="dxa" w:w="1701"/>
+          </w:tcPr>
+          <w:p>
+            <w:r>
+              <w:rPr>
+                <w:sz w:val="20"/>
+              </w:rPr>
+              <w:t>dark:text-gray-400</w:t>
+            </w:r>
+          </w:p>
+        </w:tc>
+        <w:tc>
+          <w:tcPr>
+            <w:tcW w:type="dxa" w:w="3969"/>
+          </w:tcPr>
+          <w:p>
+            <w:r>
+              <w:rPr>
+                <w:sz w:val="20"/>
+              </w:rPr>
+              <w:t>Testo muted</w:t>
+            </w:r>
+          </w:p>
+        </w:tc>
+      </w:tr>
+      <w:tr>
+        <w:tc>
+          <w:tcPr>
+            <w:tcW w:type="dxa" w:w="1701"/>
+          </w:tcPr>
+          <w:p>
+            <w:r>
+              <w:rPr>
+                <w:sz w:val="20"/>
+              </w:rPr>
+              <w:t>border-gray-200</w:t>
+            </w:r>
+          </w:p>
+        </w:tc>
+        <w:tc>
+          <w:tcPr>
+            <w:tcW w:type="dxa" w:w="1701"/>
+          </w:tcPr>
+          <w:p>
+            <w:r>
+              <w:rPr>
+                <w:sz w:val="20"/>
+              </w:rPr>
+              <w:t>dark:border-gray-700</w:t>
+            </w:r>
+          </w:p>
+        </w:tc>
+        <w:tc>
+          <w:tcPr>
+            <w:tcW w:type="dxa" w:w="3969"/>
+          </w:tcPr>
+          <w:p>
+            <w:r>
+              <w:rPr>
+                <w:sz w:val="20"/>
+              </w:rPr>
+              <w:t>Bordi card</w:t>
+            </w:r>
+          </w:p>
+        </w:tc>
+      </w:tr>
+      <w:tr>
+        <w:tc>
+          <w:tcPr>
+            <w:tcW w:type="dxa" w:w="1701"/>
+          </w:tcPr>
+          <w:p>
+            <w:r>
+              <w:rPr>
+                <w:sz w:val="20"/>
+              </w:rPr>
+              <w:t>border-gray-300</w:t>
+            </w:r>
+          </w:p>
+        </w:tc>
+        <w:tc>
+          <w:tcPr>
+            <w:tcW w:type="dxa" w:w="1701"/>
+          </w:tcPr>
+          <w:p>
+            <w:r>
+              <w:rPr>
+                <w:sz w:val="20"/>
+              </w:rPr>
+              <w:t>dark:border-gray-600</w:t>
+            </w:r>
+          </w:p>
+        </w:tc>
+        <w:tc>
+          <w:tcPr>
+            <w:tcW w:type="dxa" w:w="3969"/>
+          </w:tcPr>
+          <w:p>
+            <w:r>
+              <w:rPr>
+                <w:sz w:val="20"/>
+              </w:rPr>
+              <w:t>Bordi input</w:t>
+            </w:r>
+          </w:p>
+        </w:tc>
+      </w:tr>
+      <w:tr>
+        <w:tc>
+          <w:tcPr>
+            <w:tcW w:type="dxa" w:w="1701"/>
+          </w:tcPr>
+          <w:p>
+            <w:r>
+              <w:rPr>
+                <w:sz w:val="20"/>
+              </w:rPr>
+              <w:t>bg-red-50</w:t>
+            </w:r>
+          </w:p>
+        </w:tc>
+        <w:tc>
+          <w:tcPr>
+            <w:tcW w:type="dxa" w:w="1701"/>
+          </w:tcPr>
+          <w:p>
+            <w:r>
+              <w:rPr>
+                <w:sz w:val="20"/>
+              </w:rPr>
+              <w:t>dark:bg-red-900/30</w:t>
+            </w:r>
+          </w:p>
+        </w:tc>
+        <w:tc>
+          <w:tcPr>
+            <w:tcW w:type="dxa" w:w="3969"/>
+          </w:tcPr>
+          <w:p>
+            <w:r>
+              <w:rPr>
+                <w:sz w:val="20"/>
+              </w:rPr>
+              <w:t>Alert errore</w:t>
+            </w:r>
+          </w:p>
+        </w:tc>
+      </w:tr>
+      <w:tr>
+        <w:tc>
+          <w:tcPr>
+            <w:tcW w:type="dxa" w:w="1701"/>
+          </w:tcPr>
+          <w:p>
+            <w:r>
+              <w:rPr>
+                <w:sz w:val="20"/>
+              </w:rPr>
+              <w:t>bg-blue-100</w:t>
+            </w:r>
+          </w:p>
+        </w:tc>
+        <w:tc>
+          <w:tcPr>
+            <w:tcW w:type="dxa" w:w="1701"/>
+          </w:tcPr>
+          <w:p>
+            <w:r>
+              <w:rPr>
+                <w:sz w:val="20"/>
+              </w:rPr>
+              <w:t>dark:bg-blue-900/30</w:t>
+            </w:r>
+          </w:p>
+        </w:tc>
+        <w:tc>
+          <w:tcPr>
+            <w:tcW w:type="dxa" w:w="3969"/>
+          </w:tcPr>
+          <w:p>
+            <w:r>
+              <w:rPr>
+                <w:sz w:val="20"/>
+              </w:rPr>
+              <w:t>Badge info</w:t>
+            </w:r>
+          </w:p>
+        </w:tc>
+      </w:tr>
+    </w:tbl>
+    <w:p>
+      <w:pPr>
+        <w:pStyle w:val="Heading3"/>
+      </w:pPr>
+      <w:r>
+        <w:t>12.2.4 Fix pagina bianca al primo caricamento</w:t>
+      </w:r>
+    </w:p>
+    <w:p>
+      <w:r>
+        <w:t>Dopo un deploy, il browser puo servire un index.html cachato che referenzia bundle JS con hash obsoleti, causando una pagina bianca. Il fix prevede:</w:t>
+      </w:r>
+    </w:p>
+    <w:p>
+      <w:pPr>
+        <w:pStyle w:val="ListBullet"/>
+      </w:pPr>
+      <w:r>
+        <w:t>Program.cs: Middleware OnStarting che aggiunge Cache-Control: no-cache, no-store, must-revalidate a tutte le risposte HTML.</w:t>
+      </w:r>
+    </w:p>
+    <w:p>
+      <w:pPr>
+        <w:pStyle w:val="ListBullet"/>
+      </w:pPr>
+      <w:r>
+        <w:t>StaticFileOptions: OnPrepareResponse con no-cache per index.html, sw.js, workbox-*.js.</w:t>
+      </w:r>
+    </w:p>
+    <w:p>
+      <w:pPr>
+        <w:pStyle w:val="ListBullet"/>
+      </w:pPr>
+      <w:r>
+        <w:t>web.config: Regola IIS NoCacheHTML per risposte text/html + NoCacheSW per service worker e manifest.</w:t>
       </w:r>
     </w:p>
     <w:p>

</xml_diff>